<commit_message>
docs: fix run instructions after the move into Foresight/
The application moved into Foresight/ while Documentation/ stayed at the
repository root, which silently broke the README's setup steps: cloning
and running `docker compose up` from College-Projects/ finds no compose
file. Both quick-start paths now cd into Foresight/, and the terminal
path is self-contained rather than assuming the reader started with the
Docker one.

Report v0.2: the Deployment subsection covered only Docker. It is now
"Deployment and Execution" and describes both methods - containerised
and direct - plus the configuration they share: why one .env serves
both, why DB_HOST is fixed in the compose file instead of substituted,
and why MySQL is published on 3307. It refers to the README as the
operational reference rather than duplicating the commands, so the two
cannot drift apart.

Co-Authored-By: Claude Opus 5 <noreply@anthropic.com>
</commit_message>
<xml_diff>
--- a/Documentation/Report_Version_0.2.docx
+++ b/Documentation/Report_Version_0.2.docx
@@ -6725,28 +6725,70 @@
           <w:b/>
           <w:sz w:val="26"/>
         </w:rPr>
-        <w:t>Deployment</w:t>
-      </w:r>
-    </w:p>
-    <w:p>
-      <w:pPr>
+        <w:t>Deployment and Execution</w:t>
+      </w:r>
+    </w:p>
+    <w:p>
+      <w:pPr>
+        <w:spacing w:after="160"/>
         <w:jc w:val="both"/>
       </w:pPr>
       <w:r>
         <w:rPr>
+          <w:b w:val="0"/>
           <w:sz w:val="22"/>
         </w:rPr>
-        <w:t>The application is packaged with Docker. A single command starts a MySQL container, loads the schema, views, triggers and routines, populates a demonstration dataset and starts the API behind a production WSGI server. The same source also runs directly against a locally installed MySQL, and both modes share one configuration file.</w:t>
-      </w:r>
-    </w:p>
-    <w:p>
-      <w:pPr>
-        <w:spacing w:after="0"/>
-        <w:ind w:left="432"/>
-      </w:pPr>
-      <w:r>
-        <w:rPr>
-          <w:rFonts w:ascii="Consolas" w:hAnsi="Consolas"/>
+        <w:t>The system can be run in two ways. Both use the same source and the same configuration file, and both may be run on the same machine, as each uses its own database. Full command listings are maintained in the project README, which is the operational reference; the summary below records the approach rather than repeating every command.</w:t>
+      </w:r>
+    </w:p>
+    <w:p>
+      <w:pPr>
+        <w:spacing w:after="80"/>
+      </w:pPr>
+      <w:r>
+        <w:rPr>
+          <w:b/>
+          <w:sz w:val="22"/>
+        </w:rPr>
+        <w:t>Method 1 — Containerised execution (Docker)</w:t>
+      </w:r>
+    </w:p>
+    <w:p>
+      <w:pPr>
+        <w:spacing w:after="160"/>
+        <w:jc w:val="both"/>
+      </w:pPr>
+      <w:r>
+        <w:rPr>
+          <w:b w:val="0"/>
+          <w:sz w:val="22"/>
+        </w:rPr>
+        <w:t>The application is packaged with Docker Compose. A single command builds the image, starts a MySQL container, loads the schema, views, triggers and stored routines, populates the demonstration dataset and starts the API behind Gunicorn, a production WSGI server. Nothing needs to be installed beforehand — neither Python nor MySQL — which makes this the reliable way to reproduce the system on an unfamiliar machine.</w:t>
+      </w:r>
+    </w:p>
+    <w:p>
+      <w:pPr>
+        <w:spacing w:after="0"/>
+        <w:ind w:left="432"/>
+      </w:pPr>
+      <w:r>
+        <w:rPr>
+          <w:rFonts w:ascii="Consolas" w:hAnsi="Consolas"/>
+          <w:b w:val="0"/>
+          <w:sz w:val="18"/>
+        </w:rPr>
+        <w:t>$ cd Foresight</w:t>
+      </w:r>
+    </w:p>
+    <w:p>
+      <w:pPr>
+        <w:spacing w:after="0"/>
+        <w:ind w:left="432"/>
+      </w:pPr>
+      <w:r>
+        <w:rPr>
+          <w:rFonts w:ascii="Consolas" w:hAnsi="Consolas"/>
+          <w:b w:val="0"/>
           <w:sz w:val="18"/>
         </w:rPr>
         <w:t>$ docker compose up --build</w:t>
@@ -6760,6 +6802,7 @@
       <w:r>
         <w:rPr>
           <w:rFonts w:ascii="Consolas" w:hAnsi="Consolas"/>
+          <w:b w:val="0"/>
           <w:sz w:val="18"/>
         </w:rPr>
         <w:t xml:space="preserve"> </w:t>
@@ -6773,6 +6816,7 @@
       <w:r>
         <w:rPr>
           <w:rFonts w:ascii="Consolas" w:hAnsi="Consolas"/>
+          <w:b w:val="0"/>
           <w:sz w:val="18"/>
         </w:rPr>
         <w:t xml:space="preserve">  foresight-db    Up (healthy)</w:t>
@@ -6786,6 +6830,7 @@
       <w:r>
         <w:rPr>
           <w:rFonts w:ascii="Consolas" w:hAnsi="Consolas"/>
+          <w:b w:val="0"/>
           <w:sz w:val="18"/>
         </w:rPr>
         <w:t xml:space="preserve">  foresight-api   Up (healthy)</w:t>
@@ -6799,9 +6844,9 @@
       <w:r>
         <w:rPr>
           <w:rFonts w:ascii="Consolas" w:hAnsi="Consolas"/>
-          <w:sz w:val="18"/>
-        </w:rPr>
-        <w:lastRenderedPageBreak/>
+          <w:b w:val="0"/>
+          <w:sz w:val="18"/>
+        </w:rPr>
         <w:t xml:space="preserve"> </w:t>
       </w:r>
     </w:p>
@@ -6813,28 +6858,431 @@
       <w:r>
         <w:rPr>
           <w:rFonts w:ascii="Consolas" w:hAnsi="Consolas"/>
-          <w:sz w:val="18"/>
-        </w:rPr>
-        <w:t xml:space="preserve">  Application:   http://localhost:5000</w:t>
-      </w:r>
-    </w:p>
-    <w:p>
-      <w:pPr>
-        <w:spacing w:after="0"/>
-        <w:ind w:left="432"/>
-      </w:pPr>
-      <w:r>
-        <w:rPr>
-          <w:rFonts w:ascii="Consolas" w:hAnsi="Consolas"/>
-          <w:sz w:val="18"/>
-        </w:rPr>
-        <w:t xml:space="preserve">  API docs:      http://localhost:5000/api/docs</w:t>
-      </w:r>
-    </w:p>
-    <w:p/>
-    <w:p>
-      <w:r>
-        <w:br w:type="page"/>
+          <w:b w:val="0"/>
+          <w:sz w:val="18"/>
+        </w:rPr>
+        <w:t xml:space="preserve">  Application:  http://localhost:5000</w:t>
+      </w:r>
+    </w:p>
+    <w:p>
+      <w:pPr>
+        <w:spacing w:after="0"/>
+        <w:ind w:left="432"/>
+      </w:pPr>
+      <w:r>
+        <w:rPr>
+          <w:rFonts w:ascii="Consolas" w:hAnsi="Consolas"/>
+          <w:b w:val="0"/>
+          <w:sz w:val="18"/>
+        </w:rPr>
+        <w:t xml:space="preserve">  API docs:     http://localhost:5000/api/docs</w:t>
+      </w:r>
+    </w:p>
+    <w:p>
+      <w:pPr>
+        <w:spacing w:after="160"/>
+      </w:pPr>
+    </w:p>
+    <w:p>
+      <w:pPr>
+        <w:spacing w:after="160"/>
+        <w:jc w:val="both"/>
+      </w:pPr>
+      <w:r>
+        <w:rPr>
+          <w:b w:val="0"/>
+          <w:sz w:val="22"/>
+        </w:rPr>
+        <w:t>The database container is declared with a health check, and the API waits for it to report healthy before starting, so the two cannot start in the wrong order. The demonstration data is loaded by a one-shot container that exits on completion; it detects an already populated database and does nothing, so the stack may be restarted without destroying records added through the interface.</w:t>
+      </w:r>
+    </w:p>
+    <w:p>
+      <w:pPr>
+        <w:spacing w:after="80"/>
+      </w:pPr>
+      <w:r>
+        <w:rPr>
+          <w:b/>
+          <w:sz w:val="22"/>
+        </w:rPr>
+        <w:t>Method 2 — Direct execution (terminal)</w:t>
+      </w:r>
+    </w:p>
+    <w:p>
+      <w:pPr>
+        <w:spacing w:after="160"/>
+        <w:jc w:val="both"/>
+      </w:pPr>
+      <w:r>
+        <w:rPr>
+          <w:b w:val="0"/>
+          <w:sz w:val="22"/>
+        </w:rPr>
+        <w:t>The same source runs directly against a locally installed MySQL server. This is the form used during development, as it allows the test suite and the linter to be run against the code in place.</w:t>
+      </w:r>
+    </w:p>
+    <w:p>
+      <w:pPr>
+        <w:spacing w:after="0"/>
+        <w:ind w:left="432"/>
+      </w:pPr>
+      <w:r>
+        <w:rPr>
+          <w:rFonts w:ascii="Consolas" w:hAnsi="Consolas"/>
+          <w:b w:val="0"/>
+          <w:sz w:val="18"/>
+        </w:rPr>
+        <w:t>$ cd Foresight</w:t>
+      </w:r>
+    </w:p>
+    <w:p>
+      <w:pPr>
+        <w:spacing w:after="0"/>
+        <w:ind w:left="432"/>
+      </w:pPr>
+      <w:r>
+        <w:rPr>
+          <w:rFonts w:ascii="Consolas" w:hAnsi="Consolas"/>
+          <w:b w:val="0"/>
+          <w:sz w:val="18"/>
+        </w:rPr>
+        <w:t xml:space="preserve"> </w:t>
+      </w:r>
+    </w:p>
+    <w:p>
+      <w:pPr>
+        <w:spacing w:after="0"/>
+        <w:ind w:left="432"/>
+      </w:pPr>
+      <w:r>
+        <w:rPr>
+          <w:rFonts w:ascii="Consolas" w:hAnsi="Consolas"/>
+          <w:b w:val="0"/>
+          <w:sz w:val="18"/>
+        </w:rPr>
+        <w:t># 1. Configuration</w:t>
+      </w:r>
+    </w:p>
+    <w:p>
+      <w:pPr>
+        <w:spacing w:after="0"/>
+        <w:ind w:left="432"/>
+      </w:pPr>
+      <w:r>
+        <w:rPr>
+          <w:rFonts w:ascii="Consolas" w:hAnsi="Consolas"/>
+          <w:b w:val="0"/>
+          <w:sz w:val="18"/>
+        </w:rPr>
+        <w:t>$ cp .env.example .env        # then set DB_PASSWORD</w:t>
+      </w:r>
+    </w:p>
+    <w:p>
+      <w:pPr>
+        <w:spacing w:after="0"/>
+        <w:ind w:left="432"/>
+      </w:pPr>
+      <w:r>
+        <w:rPr>
+          <w:rFonts w:ascii="Consolas" w:hAnsi="Consolas"/>
+          <w:b w:val="0"/>
+          <w:sz w:val="18"/>
+        </w:rPr>
+        <w:t xml:space="preserve"> </w:t>
+      </w:r>
+    </w:p>
+    <w:p>
+      <w:pPr>
+        <w:spacing w:after="0"/>
+        <w:ind w:left="432"/>
+      </w:pPr>
+      <w:r>
+        <w:rPr>
+          <w:rFonts w:ascii="Consolas" w:hAnsi="Consolas"/>
+          <w:b w:val="0"/>
+          <w:sz w:val="18"/>
+        </w:rPr>
+        <w:t># 2. Dependencies</w:t>
+      </w:r>
+    </w:p>
+    <w:p>
+      <w:pPr>
+        <w:spacing w:after="0"/>
+        <w:ind w:left="432"/>
+      </w:pPr>
+      <w:r>
+        <w:rPr>
+          <w:rFonts w:ascii="Consolas" w:hAnsi="Consolas"/>
+          <w:b w:val="0"/>
+          <w:sz w:val="18"/>
+        </w:rPr>
+        <w:t>$ python -m venv .venv</w:t>
+      </w:r>
+    </w:p>
+    <w:p>
+      <w:pPr>
+        <w:spacing w:after="0"/>
+        <w:ind w:left="432"/>
+      </w:pPr>
+      <w:r>
+        <w:rPr>
+          <w:rFonts w:ascii="Consolas" w:hAnsi="Consolas"/>
+          <w:b w:val="0"/>
+          <w:sz w:val="18"/>
+        </w:rPr>
+        <w:t>$ .venv\Scripts\activate     # Windows</w:t>
+      </w:r>
+    </w:p>
+    <w:p>
+      <w:pPr>
+        <w:spacing w:after="0"/>
+        <w:ind w:left="432"/>
+      </w:pPr>
+      <w:r>
+        <w:rPr>
+          <w:rFonts w:ascii="Consolas" w:hAnsi="Consolas"/>
+          <w:b w:val="0"/>
+          <w:sz w:val="18"/>
+        </w:rPr>
+        <w:t>$ pip install -r backend/requirements.txt</w:t>
+      </w:r>
+    </w:p>
+    <w:p>
+      <w:pPr>
+        <w:spacing w:after="0"/>
+        <w:ind w:left="432"/>
+      </w:pPr>
+      <w:r>
+        <w:rPr>
+          <w:rFonts w:ascii="Consolas" w:hAnsi="Consolas"/>
+          <w:b w:val="0"/>
+          <w:sz w:val="18"/>
+        </w:rPr>
+        <w:t xml:space="preserve"> </w:t>
+      </w:r>
+    </w:p>
+    <w:p>
+      <w:pPr>
+        <w:spacing w:after="0"/>
+        <w:ind w:left="432"/>
+      </w:pPr>
+      <w:r>
+        <w:rPr>
+          <w:rFonts w:ascii="Consolas" w:hAnsi="Consolas"/>
+          <w:b w:val="0"/>
+          <w:sz w:val="18"/>
+        </w:rPr>
+        <w:t># 3. Database — the order matters, each script builds on the last</w:t>
+      </w:r>
+    </w:p>
+    <w:p>
+      <w:pPr>
+        <w:spacing w:after="0"/>
+        <w:ind w:left="432"/>
+      </w:pPr>
+      <w:r>
+        <w:rPr>
+          <w:rFonts w:ascii="Consolas" w:hAnsi="Consolas"/>
+          <w:b w:val="0"/>
+          <w:sz w:val="18"/>
+        </w:rPr>
+        <w:t>$ mysql -u root -p &lt; database/schema.sql</w:t>
+      </w:r>
+    </w:p>
+    <w:p>
+      <w:pPr>
+        <w:spacing w:after="0"/>
+        <w:ind w:left="432"/>
+      </w:pPr>
+      <w:r>
+        <w:rPr>
+          <w:rFonts w:ascii="Consolas" w:hAnsi="Consolas"/>
+          <w:b w:val="0"/>
+          <w:sz w:val="18"/>
+        </w:rPr>
+        <w:t>$ mysql -u root -p foresight &lt; database/views.sql</w:t>
+      </w:r>
+    </w:p>
+    <w:p>
+      <w:pPr>
+        <w:spacing w:after="0"/>
+        <w:ind w:left="432"/>
+      </w:pPr>
+      <w:r>
+        <w:rPr>
+          <w:rFonts w:ascii="Consolas" w:hAnsi="Consolas"/>
+          <w:b w:val="0"/>
+          <w:sz w:val="18"/>
+        </w:rPr>
+        <w:t>$ mysql -u root -p foresight &lt; database/triggers.sql</w:t>
+      </w:r>
+    </w:p>
+    <w:p>
+      <w:pPr>
+        <w:spacing w:after="0"/>
+        <w:ind w:left="432"/>
+      </w:pPr>
+      <w:r>
+        <w:rPr>
+          <w:rFonts w:ascii="Consolas" w:hAnsi="Consolas"/>
+          <w:b w:val="0"/>
+          <w:sz w:val="18"/>
+        </w:rPr>
+        <w:t>$ mysql -u root -p foresight &lt; database/procedures.sql</w:t>
+      </w:r>
+    </w:p>
+    <w:p>
+      <w:pPr>
+        <w:spacing w:after="0"/>
+        <w:ind w:left="432"/>
+      </w:pPr>
+      <w:r>
+        <w:rPr>
+          <w:rFonts w:ascii="Consolas" w:hAnsi="Consolas"/>
+          <w:b w:val="0"/>
+          <w:sz w:val="18"/>
+        </w:rPr>
+        <w:t>$ mysql -u root -p foresight &lt; database/sample_data.sql</w:t>
+      </w:r>
+    </w:p>
+    <w:p>
+      <w:pPr>
+        <w:spacing w:after="0"/>
+        <w:ind w:left="432"/>
+      </w:pPr>
+      <w:r>
+        <w:rPr>
+          <w:rFonts w:ascii="Consolas" w:hAnsi="Consolas"/>
+          <w:b w:val="0"/>
+          <w:sz w:val="18"/>
+        </w:rPr>
+        <w:t xml:space="preserve"> </w:t>
+      </w:r>
+    </w:p>
+    <w:p>
+      <w:pPr>
+        <w:spacing w:after="0"/>
+        <w:ind w:left="432"/>
+      </w:pPr>
+      <w:r>
+        <w:rPr>
+          <w:rFonts w:ascii="Consolas" w:hAnsi="Consolas"/>
+          <w:b w:val="0"/>
+          <w:sz w:val="18"/>
+        </w:rPr>
+        <w:t># 4. Demonstration data</w:t>
+      </w:r>
+    </w:p>
+    <w:p>
+      <w:pPr>
+        <w:spacing w:after="0"/>
+        <w:ind w:left="432"/>
+      </w:pPr>
+      <w:r>
+        <w:rPr>
+          <w:rFonts w:ascii="Consolas" w:hAnsi="Consolas"/>
+          <w:b w:val="0"/>
+          <w:sz w:val="18"/>
+        </w:rPr>
+        <w:t>$ python backend/seed_demo.py</w:t>
+      </w:r>
+    </w:p>
+    <w:p>
+      <w:pPr>
+        <w:spacing w:after="0"/>
+        <w:ind w:left="432"/>
+      </w:pPr>
+      <w:r>
+        <w:rPr>
+          <w:rFonts w:ascii="Consolas" w:hAnsi="Consolas"/>
+          <w:b w:val="0"/>
+          <w:sz w:val="18"/>
+        </w:rPr>
+        <w:t xml:space="preserve"> </w:t>
+      </w:r>
+    </w:p>
+    <w:p>
+      <w:pPr>
+        <w:spacing w:after="0"/>
+        <w:ind w:left="432"/>
+      </w:pPr>
+      <w:r>
+        <w:rPr>
+          <w:rFonts w:ascii="Consolas" w:hAnsi="Consolas"/>
+          <w:b w:val="0"/>
+          <w:sz w:val="18"/>
+        </w:rPr>
+        <w:t># 5. Run</w:t>
+      </w:r>
+    </w:p>
+    <w:p>
+      <w:pPr>
+        <w:spacing w:after="0"/>
+        <w:ind w:left="432"/>
+      </w:pPr>
+      <w:r>
+        <w:rPr>
+          <w:rFonts w:ascii="Consolas" w:hAnsi="Consolas"/>
+          <w:b w:val="0"/>
+          <w:sz w:val="18"/>
+        </w:rPr>
+        <w:t>$ python backend/app.py</w:t>
+      </w:r>
+    </w:p>
+    <w:p>
+      <w:pPr>
+        <w:spacing w:after="160"/>
+      </w:pPr>
+    </w:p>
+    <w:p>
+      <w:pPr>
+        <w:spacing w:after="160"/>
+        <w:jc w:val="both"/>
+      </w:pPr>
+      <w:r>
+        <w:rPr>
+          <w:b w:val="0"/>
+          <w:sz w:val="22"/>
+        </w:rPr>
+        <w:t>The five scripts must be executed in the stated order, as each depends on the objects created by those before it: the views query the tables, the stored procedures call the views, and the reference data relies on the constraints. The same statements are also available as a single consolidated listing in MySQL Code.txt, generated from these files so that the two cannot disagree.</w:t>
+      </w:r>
+    </w:p>
+    <w:p>
+      <w:pPr>
+        <w:spacing w:after="80"/>
+      </w:pPr>
+      <w:r>
+        <w:rPr>
+          <w:b/>
+          <w:sz w:val="22"/>
+        </w:rPr>
+        <w:t>Configuration shared by both methods</w:t>
+      </w:r>
+    </w:p>
+    <w:p>
+      <w:pPr>
+        <w:spacing w:after="160"/>
+        <w:jc w:val="both"/>
+      </w:pPr>
+      <w:r>
+        <w:rPr>
+          <w:b w:val="0"/>
+          <w:sz w:val="22"/>
+        </w:rPr>
+        <w:t>A single environment file serves both methods. Docker Compose reads it to substitute values into the container definitions, so the database password and signing secret are defined once. The two settings that must necessarily differ inside a container — the database host and port — are fixed in the Compose file rather than taken from the environment file, so a value written for local execution, where the host is 'localhost', cannot break the containers.</w:t>
+      </w:r>
+    </w:p>
+    <w:p>
+      <w:pPr>
+        <w:spacing w:after="160"/>
+        <w:jc w:val="both"/>
+      </w:pPr>
+      <w:r>
+        <w:rPr>
+          <w:b w:val="0"/>
+          <w:sz w:val="22"/>
+        </w:rPr>
+        <w:t>Because each method uses a separate database, both may run at the same time. Only the published port is shared, and it can be changed for either. The MySQL container is published on port 3307 rather than the default 3306 so that it does not conflict with a MySQL server already installed on the host.</w:t>
       </w:r>
     </w:p>
     <w:p>

</xml_diff>